<commit_message>
Align UAT docs with rc2 release tag
</commit_message>
<xml_diff>
--- a/.agent_work/user-testing/instructions/TowerScout_V1_RC1_UAT_User_Guide.docx
+++ b/.agent_work/user-testing/instructions/TowerScout_V1_RC1_UAT_User_Guide.docx
@@ -107,7 +107,7 @@
                 <w:rFonts w:ascii="Calibri" w:hAnsi="Calibri"/>
                 <w:sz w:val="21"/>
               </w:rPr>
-              <w:t xml:space="preserve">v0.1.0-rc1</w:t>
+              <w:t xml:space="preserve">v0.1.0-rc2</w:t>
             </w:r>
           </w:p>
         </w:tc>
@@ -775,7 +775,7 @@
                 <w:rFonts w:ascii="Calibri" w:hAnsi="Calibri"/>
                 <w:sz w:val="20"/>
               </w:rPr>
-              <w:t xml:space="preserve">towerscout-v0.1.0-rc1.zip</w:t>
+              <w:t xml:space="preserve">towerscout-v0.1.0-rc2.zip</w:t>
             </w:r>
           </w:p>
         </w:tc>
@@ -837,7 +837,7 @@
                 <w:rFonts w:ascii="Calibri" w:hAnsi="Calibri"/>
                 <w:sz w:val="20"/>
               </w:rPr>
-              <w:t xml:space="preserve">towerscout-v0.1.0-rc1.zip.sha256</w:t>
+              <w:t xml:space="preserve">towerscout-v0.1.0-rc2.zip.sha256</w:t>
             </w:r>
           </w:p>
         </w:tc>
@@ -899,7 +899,7 @@
                 <w:rFonts w:ascii="Calibri" w:hAnsi="Calibri"/>
                 <w:sz w:val="20"/>
               </w:rPr>
-              <w:t xml:space="preserve">towerscout-v0.1.0-rc1-assets-&lt;asset-version&gt;.zip</w:t>
+              <w:t xml:space="preserve">towerscout-v0.1.0-rc2-assets-&lt;asset-version&gt;.zip</w:t>
             </w:r>
           </w:p>
         </w:tc>
@@ -961,7 +961,7 @@
                 <w:rFonts w:ascii="Calibri" w:hAnsi="Calibri"/>
                 <w:sz w:val="20"/>
               </w:rPr>
-              <w:t xml:space="preserve">towerscout-v0.1.0-rc1-assets-&lt;asset-version&gt;.zip.sha256</w:t>
+              <w:t xml:space="preserve">towerscout-v0.1.0-rc2-assets-&lt;asset-version&gt;.zip.sha256</w:t>
             </w:r>
           </w:p>
         </w:tc>
@@ -1084,7 +1084,7 @@
         <w:rPr>
           <w:rFonts w:ascii="Calibri" w:hAnsi="Calibri"/>
         </w:rPr>
-        <w:t xml:space="preserve">In C:\Users\&lt;you&gt;\Documents\TowerScoutUAT, right-click towerscout-v0.1.0-rc1.zip and extract it there. After extraction, TowerScoutUAT should contain the four downloaded files plus one extracted folder named towerscout-v0.1.0-rc1. Open that extracted folder for the setup command. Leave the Model &amp; Data Package ZIP unextracted.</w:t>
+        <w:t xml:space="preserve">In C:\Users\&lt;you&gt;\Documents\TowerScoutUAT, right-click towerscout-v0.1.0-rc2.zip and extract it there. After extraction, TowerScoutUAT should contain the four downloaded files plus one extracted folder named towerscout-v0.1.0-rc2. Open that extracted folder for the setup command. Leave the Model &amp; Data Package ZIP unextracted.</w:t>
       </w:r>
     </w:p>
     <w:p>
@@ -1200,7 +1200,7 @@
                 <w:rFonts w:ascii="Calibri" w:hAnsi="Calibri"/>
                 <w:sz w:val="20"/>
               </w:rPr>
-              <w:t xml:space="preserve">C:\Users\&lt;you&gt;\Documents\TowerScoutUAT should contain the four downloaded files and one extracted towerscout-v0.1.0-rc1 folder. Open the extracted towerscout-v0.1.0-rc1 folder to run setup-towerscout.cmd. Do not put the Model &amp; Data Package ZIP inside assets\.</w:t>
+              <w:t xml:space="preserve">C:\Users\&lt;you&gt;\Documents\TowerScoutUAT should contain the four downloaded files and one extracted towerscout-v0.1.0-rc2 folder. Open the extracted towerscout-v0.1.0-rc2 folder to run setup-towerscout.cmd. Do not put the Model &amp; Data Package ZIP inside assets\.</w:t>
             </w:r>
           </w:p>
         </w:tc>
@@ -2027,7 +2027,7 @@
         <w:rPr>
           <w:rFonts w:ascii="Calibri" w:hAnsi="Calibri"/>
         </w:rPr>
-        <w:t xml:space="preserve">Run these commands from the extracted application folder, such as C:\Users\&lt;you&gt;\Documents\TowerScoutUAT\towerscout-v0.1.0-rc1. This is the same folder that contains setup-towerscout.cmd.</w:t>
+        <w:t xml:space="preserve">Run these commands from the extracted application folder, such as C:\Users\&lt;you&gt;\Documents\TowerScoutUAT\towerscout-v0.1.0-rc2. This is the same folder that contains setup-towerscout.cmd.</w:t>
       </w:r>
     </w:p>
     <w:p>
@@ -2091,7 +2091,7 @@
           <w:rFonts w:ascii="Courier New" w:hAnsi="Courier New"/>
           <w:sz w:val="20"/>
         </w:rPr>
-        <w:t xml:space="preserve">.\setup-towerscout.cmd -AssetZip C:\Users\&lt;you&gt;\Documents\TowerScoutUAT\towerscout-v0.1.0-rc1-assets-&lt;asset-version&gt;.zip</w:t>
+        <w:t xml:space="preserve">.\setup-towerscout.cmd -AssetZip C:\Users\&lt;you&gt;\Documents\TowerScoutUAT\towerscout-v0.1.0-rc2-assets-&lt;asset-version&gt;.zip</w:t>
       </w:r>
     </w:p>
     <w:p>

</xml_diff>

<commit_message>
docs(task-084): update package variant guidance
</commit_message>
<xml_diff>
--- a/.agent_work/user-testing/instructions/TowerScout_V1_RC1_UAT_User_Guide.docx
+++ b/.agent_work/user-testing/instructions/TowerScout_V1_RC1_UAT_User_Guide.docx
@@ -1,6 +1,6 @@
 
 <file path=word/document.xml><?xml version="1.0" encoding="utf-8"?>
-<w:document xmlns:w="http://schemas.openxmlformats.org/wordprocessingml/2006/main" xmlns:r="http://schemas.openxmlformats.org/officeDocument/2006/relationships">
+<w:document xmlns:w="http://schemas.openxmlformats.org/wordprocessingml/2006/main">
   <w:body>
     <w:p>
       <w:pPr>
@@ -27,7 +27,7 @@
           <w:color w:val="555555"/>
           <w:sz w:val="24"/>
         </w:rPr>
-        <w:t>Plain-language first-run guide for the RC5 Windows package</w:t>
+        <w:t xml:space="preserve">Plain-language first-run guide for the CPU/CUDA Windows packages</w:t>
       </w:r>
     </w:p>
     <w:tbl>
@@ -80,7 +80,7 @@
               <w:spacing w:after="45" w:line="260" w:lineRule="auto"/>
             </w:pPr>
             <w:r>
-              <w:t>June 15, 2026</w:t>
+              <w:t xml:space="preserve">June 16, 2026</w:t>
             </w:r>
           </w:p>
         </w:tc>
@@ -110,7 +110,7 @@
               <w:spacing w:after="45" w:line="260" w:lineRule="auto"/>
             </w:pPr>
             <w:r>
-              <w:t>RC5 package. Use the exact GitHub Release tag that support gives you.</w:t>
+              <w:t xml:space="preserve">Use the exact GitHub Release tag and package variant that support gives you.</w:t>
             </w:r>
           </w:p>
         </w:tc>
@@ -140,7 +140,7 @@
               <w:spacing w:after="45" w:line="260" w:lineRule="auto"/>
             </w:pPr>
             <w:r>
-              <w:t>Docker Desktop, CPU mode, setup-towerscout.cmd</w:t>
+              <w:t xml:space="preserve">Docker Desktop, CPU package, CPU mode, setup-towerscout.cmd</w:t>
             </w:r>
           </w:p>
         </w:tc>
@@ -170,7 +170,7 @@
               <w:spacing w:after="45" w:line="260" w:lineRule="auto"/>
             </w:pPr>
             <w:r>
-              <w:t>Use only when support assigns them: Podman CPU, Docker GPU, or Podman GPU.</w:t>
+              <w:t xml:space="preserve">Use only when support assigns them: Podman CPU, Docker GPU, or Podman GPU with the CUDA package.</w:t>
             </w:r>
           </w:p>
         </w:tc>
@@ -256,7 +256,7 @@
               <w:spacing w:after="45" w:line="260" w:lineRule="auto"/>
             </w:pPr>
             <w:r>
-              <w:t>This guide gives one normal path. Create one TowerScoutUAT folder, keep all four release files together, extract only the Application Package ZIP, then run setup-towerscout.cmd from the extracted application folder. Use Windows PowerShell, not the WSL/Ubuntu terminal.</w:t>
+              <w:t xml:space="preserve">This guide gives one normal path. Create one TowerScoutUAT folder, keep one selected Application Package ZIP, the shared Model &amp; Data Package ZIP, and both checksum files together, extract only the Application Package ZIP, then run setup-towerscout.cmd from the extracted application folder. Use Windows PowerShell, not the WSL/Ubuntu terminal.</w:t>
             </w:r>
           </w:p>
         </w:tc>
@@ -555,7 +555,7 @@
         <w:spacing w:after="80" w:line="300" w:lineRule="auto"/>
       </w:pPr>
       <w:r>
-        <w:t>At least 15 GB free disk space. 25 GB free is better for first setup, especially for GPU-capable images.</w:t>
+        <w:t xml:space="preserve">At least 15 GB free disk space. 25 GB free is better for first setup, especially when support assigns the CUDA package.</w:t>
       </w:r>
     </w:p>
     <w:p>
@@ -579,7 +579,7 @@
         <w:spacing w:after="80" w:line="300" w:lineRule="auto"/>
       </w:pPr>
       <w:r>
-        <w:t>Docker Desktop installed, approved, open, and running unless support assigned Podman.</w:t>
+        <w:t xml:space="preserve">Docker Desktop installed, approved, open, and running unless support assigned Podman.</w:t>
       </w:r>
     </w:p>
     <w:p>
@@ -610,7 +610,7 @@
         <w:spacing w:after="120" w:line="300" w:lineRule="auto"/>
       </w:pPr>
       <w:r>
-        <w:t>A container engine is the local tool that runs TowerScout on your computer. The normal UAT path uses Docker Desktop. Podman is available only when support assigns it and confirms that the Podman machine and Compose provider are ready.</w:t>
+        <w:t xml:space="preserve">A container engine is the local tool that runs TowerScout on your computer. The normal UAT path uses Docker Desktop. Podman is available only when support assigns it. If Podman is present but no approved Compose provider is available, support may ask you to run scripts\install-podman-compose-provider.cmd -Apply.</w:t>
       </w:r>
     </w:p>
     <w:p>
@@ -618,7 +618,7 @@
         <w:spacing w:after="120" w:line="300" w:lineRule="auto"/>
       </w:pPr>
       <w:r>
-        <w:t>GPU mode is optional. It is not the normal first-run path. Docker GPU and Podman GPU are support-assigned RC5 paths after support validates the selected engine. Podman GPU also requires NVIDIA CDI validation and a readiness result that says selected_device=cuda.</w:t>
+        <w:t xml:space="preserve">GPU mode is optional. It is not the normal first-run path. GPU validation requires the CUDA 12.1 Application Package. The CPU Application Package is expected to reject -Gpu on. Docker GPU and Podman GPU are support-assigned paths after support validates the selected engine. Podman GPU also requires NVIDIA CDI validation and a readiness result that says selected_device=cuda.</w:t>
       </w:r>
     </w:p>
     <w:p>
@@ -788,7 +788,7 @@
         <w:spacing w:after="80" w:line="300" w:lineRule="auto"/>
       </w:pPr>
       <w:r>
-        <w:t>Provider validation keeps failing after you confirm the key is correct.</w:t>
+        <w:t xml:space="preserve">Provider validation keeps failing after you confirm the key is correct, or support assigned GPU validation and readiness never reports selected_device=cuda.</w:t>
       </w:r>
     </w:p>
     <w:p>
@@ -840,7 +840,7 @@
         <w:spacing w:after="120" w:line="300" w:lineRule="auto"/>
       </w:pPr>
       <w:r>
-        <w:t>Download these four files from the same release Assets section. Do not use GitHub's green Code button. Do not use the automatic Source code ZIP or TAR.GZ downloads.</w:t>
+        <w:t xml:space="preserve">Download four files from the same release Assets section: one selected Application Package ZIP, its checksum, the shared Model &amp; Data Package ZIP, and its checksum. Normal testers use the CPU package. Use the CUDA 12.1 package only when support assigns GPU validation. Do not use GitHub's green Code button or automatic Source code downloads.</w:t>
       </w:r>
     </w:p>
     <w:tbl>
@@ -934,7 +934,7 @@
               <w:spacing w:after="45" w:line="260" w:lineRule="auto"/>
             </w:pPr>
             <w:r>
-              <w:t>towerscout-&lt;release-version&gt;.zip</w:t>
+              <w:t xml:space="preserve">towerscout-&lt;release-version&gt;-cpu.zip</w:t>
             </w:r>
           </w:p>
         </w:tc>
@@ -948,7 +948,7 @@
               <w:spacing w:after="45" w:line="260" w:lineRule="auto"/>
             </w:pPr>
             <w:r>
-              <w:t>Application Package ZIP</w:t>
+              <w:t xml:space="preserve">CPU Application Package ZIP</w:t>
             </w:r>
           </w:p>
         </w:tc>
@@ -978,7 +978,7 @@
               <w:spacing w:after="45" w:line="260" w:lineRule="auto"/>
             </w:pPr>
             <w:r>
-              <w:t>towerscout-&lt;release-version&gt;.zip.sha256</w:t>
+              <w:t xml:space="preserve">towerscout-&lt;release-version&gt;-cpu.zip.sha256</w:t>
             </w:r>
           </w:p>
         </w:tc>
@@ -992,7 +992,7 @@
               <w:spacing w:after="45" w:line="260" w:lineRule="auto"/>
             </w:pPr>
             <w:r>
-              <w:t>Application Package checksum</w:t>
+              <w:t xml:space="preserve">CPU Application Package checksum</w:t>
             </w:r>
           </w:p>
         </w:tc>
@@ -1150,7 +1150,7 @@
               <w:spacing w:after="45" w:line="260" w:lineRule="auto"/>
             </w:pPr>
             <w:r>
-              <w:t>The Application Package is the smaller control package. The Model &amp; Data Package is the larger asset package with model weights and ZIP-code data. The setup script checks both packages and imports the assets for you.</w:t>
+              <w:t xml:space="preserve">The Application Package is the smaller control package. Normal testers use the CPU variant. Support-assigned GPU testers use the CUDA 12.1 variant instead. The Model &amp; Data Package is the larger shared asset package with model weights and ZIP-code data. The setup script checks both packages and imports the assets for you.</w:t>
             </w:r>
           </w:p>
         </w:tc>
@@ -1197,7 +1197,7 @@
         <w:spacing w:after="120" w:line="300" w:lineRule="auto"/>
       </w:pPr>
       <w:r>
-        <w:t>Copy the four downloaded TowerScout files into that folder. Keep the two ZIP files and two .sha256 files together.</w:t>
+        <w:t xml:space="preserve">Copy the four downloaded TowerScout files into that folder. Keep the selected Application Package ZIP, the shared Model &amp; Data Package ZIP, and both .sha256 files together.</w:t>
       </w:r>
     </w:p>
     <w:p>
@@ -1205,7 +1205,7 @@
         <w:spacing w:after="120" w:line="300" w:lineRule="auto"/>
       </w:pPr>
       <w:r>
-        <w:t>In the TowerScoutUAT folder, right-click the Application Package ZIP and extract it there. Extract only this file:</w:t>
+        <w:t xml:space="preserve">In the TowerScoutUAT folder, right-click the selected Application Package ZIP and extract it there. Normal testers extract the CPU package. GPU testers extract the CUDA 12.1 package only if support assigned it. Extract only this file:</w:t>
       </w:r>
     </w:p>
     <w:p>
@@ -1218,7 +1218,7 @@
           <w:rFonts w:ascii="Consolas" w:hAnsi="Consolas"/>
           <w:sz w:val="20"/>
         </w:rPr>
-        <w:t>towerscout-&lt;release-version&gt;.zip</w:t>
+        <w:t xml:space="preserve">towerscout-&lt;release-version&gt;-cpu.zip</w:t>
       </w:r>
     </w:p>
     <w:p>
@@ -1267,7 +1267,7 @@
           <w:rFonts w:ascii="Consolas" w:hAnsi="Consolas"/>
           <w:sz w:val="20"/>
         </w:rPr>
-        <w:t>  towerscout-&lt;release-version&gt;.zip</w:t>
+        <w:t xml:space="preserve">towerscout-&lt;release-version&gt;-cpu.zip</w:t>
       </w:r>
     </w:p>
     <w:p>
@@ -1280,7 +1280,7 @@
           <w:rFonts w:ascii="Consolas" w:hAnsi="Consolas"/>
           <w:sz w:val="20"/>
         </w:rPr>
-        <w:t>  towerscout-&lt;release-version&gt;.zip.sha256</w:t>
+        <w:t xml:space="preserve">towerscout-&lt;release-version&gt;-cpu.zip.sha256</w:t>
       </w:r>
     </w:p>
     <w:p>
@@ -1319,7 +1319,7 @@
           <w:rFonts w:ascii="Consolas" w:hAnsi="Consolas"/>
           <w:sz w:val="20"/>
         </w:rPr>
-        <w:t>  towerscout-&lt;release-version&gt;\</w:t>
+        <w:t xml:space="preserve">towerscout-&lt;release-version&gt;-cpu\</w:t>
       </w:r>
     </w:p>
     <w:p>
@@ -1415,7 +1415,7 @@
         <w:spacing w:after="120" w:line="300" w:lineRule="auto"/>
       </w:pPr>
       <w:r>
-        <w:t>Before running setup, confirm Docker Desktop is open and running. If support assigned Podman, confirm the Podman machine is running and the approved Compose provider is available.</w:t>
+        <w:t xml:space="preserve">Before running setup, confirm Docker Desktop is open and running. If support assigned Podman, confirm the Podman machine is running. If setup reports that no approved Compose provider is available, run scripts\install-podman-compose-provider.cmd -Apply and retry setup.</w:t>
       </w:r>
     </w:p>
     <w:p>
@@ -1571,7 +1571,7 @@
               <w:spacing w:after="45" w:line="260" w:lineRule="auto"/>
             </w:pPr>
             <w:r>
-              <w:t>Do not run optional tracks unless support assigned them. Complete the normal Docker Desktop CPU path first unless support gives different instructions.</w:t>
+              <w:t xml:space="preserve">Do not run optional tracks unless support assigned them. Complete the normal Docker Desktop CPU path first unless support gives different instructions. GPU tracks require the CUDA 12.1 Application Package; the CPU package is expected to reject -Gpu on.</w:t>
             </w:r>
           </w:p>
         </w:tc>
@@ -1701,7 +1701,7 @@
               <w:spacing w:after="45" w:line="260" w:lineRule="auto"/>
             </w:pPr>
             <w:r>
-              <w:t>Only if support assigned Podman because Docker Desktop is not the selected local engine.</w:t>
+              <w:t xml:space="preserve">Only if support assigned Podman because Docker Desktop is not the selected local engine. Run the provider helper if setup says no approved Compose provider is available.</w:t>
             </w:r>
           </w:p>
         </w:tc>
@@ -1759,7 +1759,7 @@
               <w:spacing w:after="45" w:line="260" w:lineRule="auto"/>
             </w:pPr>
             <w:r>
-              <w:t>Only on a workstation where support is validating NVIDIA GPU access through Docker.</w:t>
+              <w:t xml:space="preserve">Only on a workstation where support is validating NVIDIA GPU access through Docker and assigned the CUDA 12.1 package.</w:t>
             </w:r>
           </w:p>
         </w:tc>
@@ -1833,7 +1833,7 @@
               <w:spacing w:after="45" w:line="260" w:lineRule="auto"/>
             </w:pPr>
             <w:r>
-              <w:t>Only after support validates the non-Docker-Desktop Compose provider and NVIDIA CDI path.</w:t>
+              <w:t xml:space="preserve">Only after support validates the non-Docker-Desktop Compose provider, NVIDIA CDI path, and CUDA 12.1 package.</w:t>
             </w:r>
           </w:p>
         </w:tc>
@@ -1880,7 +1880,7 @@
         <w:spacing w:after="120" w:line="300" w:lineRule="auto"/>
       </w:pPr>
       <w:r>
-        <w:t>Use -Gpu auto only when support is exploring GPU validation with CPU fallback. Use -Gpu on only when support expects CUDA to be available inside the container. With -Gpu on, the launcher fails closed unless TowerScout reports selected_device=cuda.</w:t>
+        <w:t xml:space="preserve">Use -Gpu auto only when support is exploring GPU validation with CPU fallback. Use -Gpu on only when support expects CUDA to be available inside the container. The CPU package should reject GPU mode. With -Gpu on, the CUDA package launcher fails closed unless TowerScout reports selected_device=cuda.</w:t>
       </w:r>
     </w:p>
     <w:p>
@@ -2862,7 +2862,7 @@
               <w:spacing w:after="45" w:line="260" w:lineRule="auto"/>
             </w:pPr>
             <w:r>
-              <w:t>Windows version, engine version, release tag, and package folder name.</w:t>
+              <w:t xml:space="preserve">Windows version, engine version, release tag, selected package variant, and package folder name.</w:t>
             </w:r>
           </w:p>
         </w:tc>
@@ -3201,7 +3201,7 @@
               <w:spacing w:after="45" w:line="260" w:lineRule="auto"/>
             </w:pPr>
             <w:r>
-              <w:t>Docker Desktop or Podman, browser port, and Azure Maps, Google Maps, or neither yet.</w:t>
+              <w:t xml:space="preserve">CPU or CUDA package, Docker Desktop or Podman, browser port, and Azure Maps, Google Maps, or neither yet.</w:t>
             </w:r>
           </w:p>
         </w:tc>
@@ -3458,7 +3458,7 @@
               <w:spacing w:after="45" w:line="260" w:lineRule="auto"/>
             </w:pPr>
             <w:r>
-              <w:t>Docker GPU support-assigned</w:t>
+              <w:t xml:space="preserve">Docker GPU support-assigned CUDA package</w:t>
             </w:r>
           </w:p>
         </w:tc>
@@ -3606,7 +3606,7 @@
               <w:spacing w:after="45" w:line="260" w:lineRule="auto"/>
             </w:pPr>
             <w:r>
-              <w:t>Podman GPU support-assigned</w:t>
+              <w:t xml:space="preserve">Podman GPU support-assigned CUDA package</w:t>
             </w:r>
           </w:p>
         </w:tc>
@@ -3709,7 +3709,7 @@
         <w:spacing w:after="120" w:line="300" w:lineRule="auto"/>
       </w:pPr>
       <w:r>
-        <w:t>If you used Podman for either command, replace -Engine docker with -Engine podman.</w:t>
+        <w:t xml:space="preserve">If you used Podman for either command, replace -Engine docker with -Engine podman. If setup reports no approved Podman Compose provider, run scripts\install-podman-compose-provider.cmd -Apply.</w:t>
       </w:r>
     </w:p>
     <w:p>

</xml_diff>

<commit_message>
docs(task-084): refine UAT guide structure
</commit_message>
<xml_diff>
--- a/.agent_work/user-testing/instructions/TowerScout_V1_RC1_UAT_User_Guide.docx
+++ b/.agent_work/user-testing/instructions/TowerScout_V1_RC1_UAT_User_Guide.docx
@@ -213,6 +213,519 @@
       <w:r>
         <w:t/>
       </w:r>
+    </w:p>
+    <w:p>
+      <w:pPr>
+        <w:pStyle w:val="Heading1"/>
+        <w:keepNext/>
+      </w:pPr>
+      <w:r>
+        <w:t>Table of Contents</w:t>
+      </w:r>
+    </w:p>
+    <w:tbl>
+      <w:tblPr>
+        <w:tblW w:type="auto" w:w="0"/>
+        <w:jc w:val="left"/>
+        <w:tblLook w:firstColumn="1" w:firstRow="1" w:lastColumn="0" w:lastRow="0" w:noHBand="0" w:noVBand="1" w:val="04A0"/>
+        <w:tblBorders>
+          <w:top w:val="nil"/>
+          <w:left w:val="nil"/>
+          <w:bottom w:val="nil"/>
+          <w:right w:val="nil"/>
+          <w:insideH w:val="nil"/>
+          <w:insideV w:val="nil"/>
+        </w:tblBorders>
+      </w:tblPr>
+      <w:tblGrid>
+        <w:gridCol w:w="4680"/>
+        <w:gridCol w:w="4680"/>
+      </w:tblGrid>
+      <w:tr>
+        <w:tc>
+          <w:tcPr>
+            <w:tcW w:type="dxa" w:w="8064"/>
+            <w:vAlign w:val="center"/>
+          </w:tcPr>
+          <w:p>
+            <w:pPr>
+              <w:jc w:val="left"/>
+            </w:pPr>
+            <w:r/>
+            <w:r>
+              <w:rPr>
+                <w:b w:val="0"/>
+                <w:sz w:val="20"/>
+              </w:rPr>
+              <w:t>1. What You Are Testing</w:t>
+            </w:r>
+          </w:p>
+        </w:tc>
+        <w:tc>
+          <w:tcPr>
+            <w:tcW w:type="dxa" w:w="864"/>
+            <w:vAlign w:val="center"/>
+          </w:tcPr>
+          <w:p>
+            <w:pPr>
+              <w:jc w:val="right"/>
+            </w:pPr>
+            <w:r/>
+            <w:r>
+              <w:rPr>
+                <w:b w:val="0"/>
+                <w:sz w:val="20"/>
+              </w:rPr>
+              <w:t>2</w:t>
+            </w:r>
+          </w:p>
+        </w:tc>
+      </w:tr>
+      <w:tr>
+        <w:tc>
+          <w:tcPr>
+            <w:tcW w:type="dxa" w:w="8064"/>
+            <w:vAlign w:val="center"/>
+          </w:tcPr>
+          <w:p>
+            <w:pPr>
+              <w:jc w:val="left"/>
+            </w:pPr>
+            <w:r/>
+            <w:r>
+              <w:rPr>
+                <w:b w:val="0"/>
+                <w:sz w:val="20"/>
+              </w:rPr>
+              <w:t>2. Before You Start</w:t>
+            </w:r>
+          </w:p>
+        </w:tc>
+        <w:tc>
+          <w:tcPr>
+            <w:tcW w:type="dxa" w:w="864"/>
+            <w:vAlign w:val="center"/>
+          </w:tcPr>
+          <w:p>
+            <w:pPr>
+              <w:jc w:val="right"/>
+            </w:pPr>
+            <w:r/>
+            <w:r>
+              <w:rPr>
+                <w:b w:val="0"/>
+                <w:sz w:val="20"/>
+              </w:rPr>
+              <w:t>2</w:t>
+            </w:r>
+          </w:p>
+        </w:tc>
+      </w:tr>
+      <w:tr>
+        <w:tc>
+          <w:tcPr>
+            <w:tcW w:type="dxa" w:w="8064"/>
+            <w:vAlign w:val="center"/>
+          </w:tcPr>
+          <w:p>
+            <w:pPr>
+              <w:jc w:val="left"/>
+            </w:pPr>
+            <w:r/>
+            <w:r>
+              <w:rPr>
+                <w:b w:val="0"/>
+                <w:sz w:val="20"/>
+              </w:rPr>
+              <w:t>3. Download The Four Release Files</w:t>
+            </w:r>
+          </w:p>
+        </w:tc>
+        <w:tc>
+          <w:tcPr>
+            <w:tcW w:type="dxa" w:w="864"/>
+            <w:vAlign w:val="center"/>
+          </w:tcPr>
+          <w:p>
+            <w:pPr>
+              <w:jc w:val="right"/>
+            </w:pPr>
+            <w:r/>
+            <w:r>
+              <w:rPr>
+                <w:b w:val="0"/>
+                <w:sz w:val="20"/>
+              </w:rPr>
+              <w:t>3</w:t>
+            </w:r>
+          </w:p>
+        </w:tc>
+      </w:tr>
+      <w:tr>
+        <w:tc>
+          <w:tcPr>
+            <w:tcW w:type="dxa" w:w="8064"/>
+            <w:vAlign w:val="center"/>
+          </w:tcPr>
+          <w:p>
+            <w:pPr>
+              <w:jc w:val="left"/>
+            </w:pPr>
+            <w:r/>
+            <w:r>
+              <w:rPr>
+                <w:b w:val="0"/>
+                <w:sz w:val="20"/>
+              </w:rPr>
+              <w:t>4. Create One UAT Folder</w:t>
+            </w:r>
+          </w:p>
+        </w:tc>
+        <w:tc>
+          <w:tcPr>
+            <w:tcW w:type="dxa" w:w="864"/>
+            <w:vAlign w:val="center"/>
+          </w:tcPr>
+          <w:p>
+            <w:pPr>
+              <w:jc w:val="right"/>
+            </w:pPr>
+            <w:r/>
+            <w:r>
+              <w:rPr>
+                <w:b w:val="0"/>
+                <w:sz w:val="20"/>
+              </w:rPr>
+              <w:t>4</w:t>
+            </w:r>
+          </w:p>
+        </w:tc>
+      </w:tr>
+      <w:tr>
+        <w:tc>
+          <w:tcPr>
+            <w:tcW w:type="dxa" w:w="8064"/>
+            <w:vAlign w:val="center"/>
+          </w:tcPr>
+          <w:p>
+            <w:pPr>
+              <w:jc w:val="left"/>
+            </w:pPr>
+            <w:r/>
+            <w:r>
+              <w:rPr>
+                <w:b w:val="0"/>
+                <w:sz w:val="20"/>
+              </w:rPr>
+              <w:t>5. Run Setup</w:t>
+            </w:r>
+          </w:p>
+        </w:tc>
+        <w:tc>
+          <w:tcPr>
+            <w:tcW w:type="dxa" w:w="864"/>
+            <w:vAlign w:val="center"/>
+          </w:tcPr>
+          <w:p>
+            <w:pPr>
+              <w:jc w:val="right"/>
+            </w:pPr>
+            <w:r/>
+            <w:r>
+              <w:rPr>
+                <w:b w:val="0"/>
+                <w:sz w:val="20"/>
+              </w:rPr>
+              <w:t>5</w:t>
+            </w:r>
+          </w:p>
+        </w:tc>
+      </w:tr>
+      <w:tr>
+        <w:tc>
+          <w:tcPr>
+            <w:tcW w:type="dxa" w:w="8064"/>
+            <w:vAlign w:val="center"/>
+          </w:tcPr>
+          <w:p>
+            <w:pPr>
+              <w:jc w:val="left"/>
+            </w:pPr>
+            <w:r/>
+            <w:r>
+              <w:rPr>
+                <w:b w:val="0"/>
+                <w:sz w:val="20"/>
+              </w:rPr>
+              <w:t>6. Complete Provider Setup</w:t>
+            </w:r>
+          </w:p>
+        </w:tc>
+        <w:tc>
+          <w:tcPr>
+            <w:tcW w:type="dxa" w:w="864"/>
+            <w:vAlign w:val="center"/>
+          </w:tcPr>
+          <w:p>
+            <w:pPr>
+              <w:jc w:val="right"/>
+            </w:pPr>
+            <w:r/>
+            <w:r>
+              <w:rPr>
+                <w:b w:val="0"/>
+                <w:sz w:val="20"/>
+              </w:rPr>
+              <w:t>6</w:t>
+            </w:r>
+          </w:p>
+        </w:tc>
+      </w:tr>
+      <w:tr>
+        <w:tc>
+          <w:tcPr>
+            <w:tcW w:type="dxa" w:w="8064"/>
+            <w:vAlign w:val="center"/>
+          </w:tcPr>
+          <w:p>
+            <w:pPr>
+              <w:jc w:val="left"/>
+            </w:pPr>
+            <w:r/>
+            <w:r>
+              <w:rPr>
+                <w:b w:val="0"/>
+                <w:sz w:val="20"/>
+              </w:rPr>
+              <w:t>7. Run The Required Smoke Test</w:t>
+            </w:r>
+          </w:p>
+        </w:tc>
+        <w:tc>
+          <w:tcPr>
+            <w:tcW w:type="dxa" w:w="864"/>
+            <w:vAlign w:val="center"/>
+          </w:tcPr>
+          <w:p>
+            <w:pPr>
+              <w:jc w:val="right"/>
+            </w:pPr>
+            <w:r/>
+            <w:r>
+              <w:rPr>
+                <w:b w:val="0"/>
+                <w:sz w:val="20"/>
+              </w:rPr>
+              <w:t>6</w:t>
+            </w:r>
+          </w:p>
+        </w:tc>
+      </w:tr>
+      <w:tr>
+        <w:tc>
+          <w:tcPr>
+            <w:tcW w:type="dxa" w:w="8064"/>
+            <w:vAlign w:val="center"/>
+          </w:tcPr>
+          <w:p>
+            <w:pPr>
+              <w:jc w:val="left"/>
+            </w:pPr>
+            <w:r/>
+            <w:r>
+              <w:rPr>
+                <w:b w:val="0"/>
+                <w:sz w:val="20"/>
+              </w:rPr>
+              <w:t>8. Stop, Restart, Or Check Status</w:t>
+            </w:r>
+          </w:p>
+        </w:tc>
+        <w:tc>
+          <w:tcPr>
+            <w:tcW w:type="dxa" w:w="864"/>
+            <w:vAlign w:val="center"/>
+          </w:tcPr>
+          <w:p>
+            <w:pPr>
+              <w:jc w:val="right"/>
+            </w:pPr>
+            <w:r/>
+            <w:r>
+              <w:rPr>
+                <w:b w:val="0"/>
+                <w:sz w:val="20"/>
+              </w:rPr>
+              <w:t>7</w:t>
+            </w:r>
+          </w:p>
+        </w:tc>
+      </w:tr>
+      <w:tr>
+        <w:tc>
+          <w:tcPr>
+            <w:tcW w:type="dxa" w:w="8064"/>
+            <w:vAlign w:val="center"/>
+          </w:tcPr>
+          <w:p>
+            <w:pPr>
+              <w:jc w:val="left"/>
+            </w:pPr>
+            <w:r/>
+            <w:r>
+              <w:rPr>
+                <w:b w:val="0"/>
+                <w:sz w:val="20"/>
+              </w:rPr>
+              <w:t>9. What To Send If You Are Blocked</w:t>
+            </w:r>
+          </w:p>
+        </w:tc>
+        <w:tc>
+          <w:tcPr>
+            <w:tcW w:type="dxa" w:w="864"/>
+            <w:vAlign w:val="center"/>
+          </w:tcPr>
+          <w:p>
+            <w:pPr>
+              <w:jc w:val="right"/>
+            </w:pPr>
+            <w:r/>
+            <w:r>
+              <w:rPr>
+                <w:b w:val="0"/>
+                <w:sz w:val="20"/>
+              </w:rPr>
+              <w:t>8</w:t>
+            </w:r>
+          </w:p>
+        </w:tc>
+      </w:tr>
+      <w:tr>
+        <w:tc>
+          <w:tcPr>
+            <w:tcW w:type="dxa" w:w="8064"/>
+            <w:vAlign w:val="center"/>
+          </w:tcPr>
+          <w:p>
+            <w:pPr>
+              <w:jc w:val="left"/>
+            </w:pPr>
+            <w:r/>
+            <w:r>
+              <w:rPr>
+                <w:b w:val="0"/>
+                <w:sz w:val="20"/>
+              </w:rPr>
+              <w:t>Appendix A. Optional Support-Assigned Tracks</w:t>
+            </w:r>
+          </w:p>
+        </w:tc>
+        <w:tc>
+          <w:tcPr>
+            <w:tcW w:type="dxa" w:w="864"/>
+            <w:vAlign w:val="center"/>
+          </w:tcPr>
+          <w:p>
+            <w:pPr>
+              <w:jc w:val="right"/>
+            </w:pPr>
+            <w:r/>
+            <w:r>
+              <w:rPr>
+                <w:b w:val="0"/>
+                <w:sz w:val="20"/>
+              </w:rPr>
+              <w:t>9</w:t>
+            </w:r>
+          </w:p>
+        </w:tc>
+      </w:tr>
+      <w:tr>
+        <w:tc>
+          <w:tcPr>
+            <w:tcW w:type="dxa" w:w="8064"/>
+            <w:vAlign w:val="center"/>
+          </w:tcPr>
+          <w:p>
+            <w:pPr>
+              <w:jc w:val="left"/>
+            </w:pPr>
+            <w:r/>
+            <w:r>
+              <w:rPr>
+                <w:b w:val="0"/>
+                <w:sz w:val="20"/>
+              </w:rPr>
+              <w:t>Appendix B. Command Reference</w:t>
+            </w:r>
+          </w:p>
+        </w:tc>
+        <w:tc>
+          <w:tcPr>
+            <w:tcW w:type="dxa" w:w="864"/>
+            <w:vAlign w:val="center"/>
+          </w:tcPr>
+          <w:p>
+            <w:pPr>
+              <w:jc w:val="right"/>
+            </w:pPr>
+            <w:r/>
+            <w:r>
+              <w:rPr>
+                <w:b w:val="0"/>
+                <w:sz w:val="20"/>
+              </w:rPr>
+              <w:t>10</w:t>
+            </w:r>
+          </w:p>
+        </w:tc>
+      </w:tr>
+      <w:tr>
+        <w:tc>
+          <w:tcPr>
+            <w:tcW w:type="dxa" w:w="8064"/>
+            <w:vAlign w:val="center"/>
+          </w:tcPr>
+          <w:p>
+            <w:pPr>
+              <w:jc w:val="left"/>
+            </w:pPr>
+            <w:r/>
+            <w:r>
+              <w:rPr>
+                <w:b w:val="0"/>
+                <w:sz w:val="20"/>
+              </w:rPr>
+              <w:t>Appendix C. Source, Licenses, And Notices</w:t>
+            </w:r>
+          </w:p>
+        </w:tc>
+        <w:tc>
+          <w:tcPr>
+            <w:tcW w:type="dxa" w:w="864"/>
+            <w:vAlign w:val="center"/>
+          </w:tcPr>
+          <w:p>
+            <w:pPr>
+              <w:jc w:val="right"/>
+            </w:pPr>
+            <w:r/>
+            <w:r>
+              <w:rPr>
+                <w:b w:val="0"/>
+                <w:sz w:val="20"/>
+              </w:rPr>
+              <w:t>11</w:t>
+            </w:r>
+          </w:p>
+        </w:tc>
+      </w:tr>
+    </w:tbl>
+    <w:p>
+      <w:pPr>
+        <w:spacing w:after="160"/>
+      </w:pPr>
     </w:p>
     <w:tbl>
       <w:tblPr>
@@ -1515,387 +2028,18 @@
       </w:r>
     </w:p>
     <w:p>
+      <w:r>
+        <w:t>Support-assigned Podman and GPU tracks are not part of the normal first-run path. Use Appendix A only if support assigns one of those tracks.</w:t>
+      </w:r>
+    </w:p>
+    <w:p>
       <w:pPr>
         <w:pStyle w:val="Heading1"/>
         <w:keepNext/>
         <w:spacing w:before="260" w:after="120" w:line="300" w:lineRule="auto"/>
       </w:pPr>
       <w:r>
-        <w:rPr>
-          <w:b/>
-          <w:color w:val="2E74B5"/>
-          <w:sz w:val="32"/>
-        </w:rPr>
-        <w:t>6. Optional Support-Assigned Tracks</w:t>
-      </w:r>
-    </w:p>
-    <w:tbl>
-      <w:tblPr>
-        <w:tblW w:w="9360" w:type="dxa"/>
-        <w:tblInd w:w="120" w:type="dxa"/>
-        <w:tblBorders>
-          <w:top w:val="single" w:sz="4" w:space="0" w:color="C7CFDA"/>
-          <w:left w:val="single" w:sz="4" w:space="0" w:color="C7CFDA"/>
-          <w:bottom w:val="single" w:sz="4" w:space="0" w:color="C7CFDA"/>
-          <w:right w:val="single" w:sz="4" w:space="0" w:color="C7CFDA"/>
-          <w:insideH w:val="single" w:sz="4" w:space="0" w:color="D7DDE6"/>
-          <w:insideV w:val="single" w:sz="4" w:space="0" w:color="D7DDE6"/>
-        </w:tblBorders>
-        <w:tblCellMar>
-          <w:top w:w="90" w:type="dxa"/>
-          <w:left w:w="120" w:type="dxa"/>
-          <w:bottom w:w="90" w:type="dxa"/>
-          <w:right w:w="120" w:type="dxa"/>
-        </w:tblCellMar>
-      </w:tblPr>
-      <w:tblGrid>
-        <w:gridCol w:w="9360"/>
-      </w:tblGrid>
-      <w:tr>
-        <w:tc>
-          <w:tcPr>
-            <w:tcW w:w="9360" w:type="dxa"/>
-            <w:shd w:val="clear" w:color="auto" w:fill="F4F6F9"/>
-            <w:vAlign w:val="center"/>
-          </w:tcPr>
-          <w:p>
-            <w:pPr>
-              <w:spacing w:after="45" w:line="260" w:lineRule="auto"/>
-            </w:pPr>
-            <w:r>
-              <w:t>Default testers can skip this section</w:t>
-            </w:r>
-          </w:p>
-          <w:p>
-            <w:pPr>
-              <w:spacing w:after="45" w:line="260" w:lineRule="auto"/>
-            </w:pPr>
-            <w:r>
-              <w:t xml:space="preserve">Do not run optional tracks unless support assigned them. Complete the normal Docker Desktop CPU path first unless support gives different instructions. GPU tracks require the CUDA 12.1 Application Package; the CPU package is expected to reject -Gpu on.</w:t>
-            </w:r>
-          </w:p>
-        </w:tc>
-      </w:tr>
-    </w:tbl>
-    <w:tbl>
-      <w:tblPr>
-        <w:tblW w:w="9360" w:type="dxa"/>
-        <w:tblInd w:w="120" w:type="dxa"/>
-        <w:tblBorders>
-          <w:top w:val="single" w:sz="4" w:space="0" w:color="C7CFDA"/>
-          <w:left w:val="single" w:sz="4" w:space="0" w:color="C7CFDA"/>
-          <w:bottom w:val="single" w:sz="4" w:space="0" w:color="C7CFDA"/>
-          <w:right w:val="single" w:sz="4" w:space="0" w:color="C7CFDA"/>
-          <w:insideH w:val="single" w:sz="4" w:space="0" w:color="D7DDE6"/>
-          <w:insideV w:val="single" w:sz="4" w:space="0" w:color="D7DDE6"/>
-        </w:tblBorders>
-        <w:tblCellMar>
-          <w:top w:w="90" w:type="dxa"/>
-          <w:left w:w="120" w:type="dxa"/>
-          <w:bottom w:w="90" w:type="dxa"/>
-          <w:right w:w="120" w:type="dxa"/>
-        </w:tblCellMar>
-      </w:tblPr>
-      <w:tblGrid>
-        <w:gridCol w:w="1500"/>
-        <w:gridCol w:w="3000"/>
-        <w:gridCol w:w="2600"/>
-        <w:gridCol w:w="2260"/>
-      </w:tblGrid>
-      <w:tr>
-        <w:tc>
-          <w:tcPr>
-            <w:tcW w:w="1500" w:type="dxa"/>
-            <w:shd w:val="clear" w:color="auto" w:fill="E8EEF5"/>
-            <w:vAlign w:val="center"/>
-          </w:tcPr>
-          <w:p>
-            <w:pPr>
-              <w:spacing w:after="45" w:line="260" w:lineRule="auto"/>
-            </w:pPr>
-            <w:r>
-              <w:rPr>
-                <w:b/>
-              </w:rPr>
-              <w:t>Track</w:t>
-            </w:r>
-          </w:p>
-        </w:tc>
-        <w:tc>
-          <w:tcPr>
-            <w:tcW w:w="3000" w:type="dxa"/>
-            <w:shd w:val="clear" w:color="auto" w:fill="E8EEF5"/>
-            <w:vAlign w:val="center"/>
-          </w:tcPr>
-          <w:p>
-            <w:pPr>
-              <w:spacing w:after="45" w:line="260" w:lineRule="auto"/>
-            </w:pPr>
-            <w:r>
-              <w:rPr>
-                <w:b/>
-              </w:rPr>
-              <w:t>When to use it</w:t>
-            </w:r>
-          </w:p>
-        </w:tc>
-        <w:tc>
-          <w:tcPr>
-            <w:tcW w:w="2600" w:type="dxa"/>
-            <w:shd w:val="clear" w:color="auto" w:fill="E8EEF5"/>
-            <w:vAlign w:val="center"/>
-          </w:tcPr>
-          <w:p>
-            <w:pPr>
-              <w:spacing w:after="45" w:line="260" w:lineRule="auto"/>
-            </w:pPr>
-            <w:r>
-              <w:rPr>
-                <w:b/>
-              </w:rPr>
-              <w:t>Setup command</w:t>
-            </w:r>
-          </w:p>
-        </w:tc>
-        <w:tc>
-          <w:tcPr>
-            <w:tcW w:w="2260" w:type="dxa"/>
-            <w:shd w:val="clear" w:color="auto" w:fill="E8EEF5"/>
-            <w:vAlign w:val="center"/>
-          </w:tcPr>
-          <w:p>
-            <w:pPr>
-              <w:spacing w:after="45" w:line="260" w:lineRule="auto"/>
-            </w:pPr>
-            <w:r>
-              <w:rPr>
-                <w:b/>
-              </w:rPr>
-              <w:t>What to record</w:t>
-            </w:r>
-          </w:p>
-        </w:tc>
-      </w:tr>
-      <w:tr>
-        <w:tc>
-          <w:tcPr>
-            <w:tcW w:w="1500" w:type="dxa"/>
-            <w:vAlign w:val="center"/>
-          </w:tcPr>
-          <w:p>
-            <w:pPr>
-              <w:spacing w:after="45" w:line="260" w:lineRule="auto"/>
-            </w:pPr>
-            <w:r>
-              <w:t>Podman CPU</w:t>
-            </w:r>
-          </w:p>
-        </w:tc>
-        <w:tc>
-          <w:tcPr>
-            <w:tcW w:w="3000" w:type="dxa"/>
-            <w:vAlign w:val="center"/>
-          </w:tcPr>
-          <w:p>
-            <w:pPr>
-              <w:spacing w:after="45" w:line="260" w:lineRule="auto"/>
-            </w:pPr>
-            <w:r>
-              <w:t xml:space="preserve">Only if support assigned Podman because Docker Desktop is not the selected local engine. Run the provider helper if setup says no approved Compose provider is available.</w:t>
-            </w:r>
-          </w:p>
-        </w:tc>
-        <w:tc>
-          <w:tcPr>
-            <w:tcW w:w="2600" w:type="dxa"/>
-            <w:vAlign w:val="center"/>
-          </w:tcPr>
-          <w:p>
-            <w:pPr>
-              <w:spacing w:after="45" w:line="260" w:lineRule="auto"/>
-            </w:pPr>
-            <w:r>
-              <w:t>.\setup-towerscout.cmd -Engine podman</w:t>
-            </w:r>
-          </w:p>
-        </w:tc>
-        <w:tc>
-          <w:tcPr>
-            <w:tcW w:w="2260" w:type="dxa"/>
-            <w:vAlign w:val="center"/>
-          </w:tcPr>
-          <w:p>
-            <w:pPr>
-              <w:spacing w:after="45" w:line="260" w:lineRule="auto"/>
-            </w:pPr>
-            <w:r>
-              <w:t>Podman version, machine status, Compose provider, port, readiness state, and smoke result.</w:t>
-            </w:r>
-          </w:p>
-        </w:tc>
-      </w:tr>
-      <w:tr>
-        <w:tc>
-          <w:tcPr>
-            <w:tcW w:w="1500" w:type="dxa"/>
-            <w:vAlign w:val="center"/>
-          </w:tcPr>
-          <w:p>
-            <w:pPr>
-              <w:spacing w:after="45" w:line="260" w:lineRule="auto"/>
-            </w:pPr>
-            <w:r>
-              <w:t>Docker GPU</w:t>
-            </w:r>
-          </w:p>
-        </w:tc>
-        <w:tc>
-          <w:tcPr>
-            <w:tcW w:w="3000" w:type="dxa"/>
-            <w:vAlign w:val="center"/>
-          </w:tcPr>
-          <w:p>
-            <w:pPr>
-              <w:spacing w:after="45" w:line="260" w:lineRule="auto"/>
-            </w:pPr>
-            <w:r>
-              <w:t xml:space="preserve">Only on a workstation where support is validating NVIDIA GPU access through Docker and assigned the CUDA 12.1 package.</w:t>
-            </w:r>
-          </w:p>
-        </w:tc>
-        <w:tc>
-          <w:tcPr>
-            <w:tcW w:w="2600" w:type="dxa"/>
-            <w:vAlign w:val="center"/>
-          </w:tcPr>
-          <w:p>
-            <w:pPr>
-              <w:spacing w:after="45" w:line="260" w:lineRule="auto"/>
-            </w:pPr>
-            <w:r>
-              <w:t>.\setup-towerscout.cmd -Engine docker -Gpu auto</w:t>
-            </w:r>
-          </w:p>
-          <w:p>
-            <w:pPr>
-              <w:spacing w:after="45" w:line="260" w:lineRule="auto"/>
-            </w:pPr>
-            <w:r>
-              <w:t>or</w:t>
-            </w:r>
-          </w:p>
-          <w:p>
-            <w:pPr>
-              <w:spacing w:after="45" w:line="260" w:lineRule="auto"/>
-            </w:pPr>
-            <w:r>
-              <w:t>.\setup-towerscout.cmd -Engine docker -Gpu on</w:t>
-            </w:r>
-          </w:p>
-        </w:tc>
-        <w:tc>
-          <w:tcPr>
-            <w:tcW w:w="2260" w:type="dxa"/>
-            <w:vAlign w:val="center"/>
-          </w:tcPr>
-          <w:p>
-            <w:pPr>
-              <w:spacing w:after="45" w:line="260" w:lineRule="auto"/>
-            </w:pPr>
-            <w:r>
-              <w:t>GPU mode, readiness details, selected_device, timing, tile count, detection count, and parity notes.</w:t>
-            </w:r>
-          </w:p>
-        </w:tc>
-      </w:tr>
-      <w:tr>
-        <w:tc>
-          <w:tcPr>
-            <w:tcW w:w="1500" w:type="dxa"/>
-            <w:vAlign w:val="center"/>
-          </w:tcPr>
-          <w:p>
-            <w:pPr>
-              <w:spacing w:after="45" w:line="260" w:lineRule="auto"/>
-            </w:pPr>
-            <w:r>
-              <w:t>Podman GPU</w:t>
-            </w:r>
-          </w:p>
-        </w:tc>
-        <w:tc>
-          <w:tcPr>
-            <w:tcW w:w="3000" w:type="dxa"/>
-            <w:vAlign w:val="center"/>
-          </w:tcPr>
-          <w:p>
-            <w:pPr>
-              <w:spacing w:after="45" w:line="260" w:lineRule="auto"/>
-            </w:pPr>
-            <w:r>
-              <w:t xml:space="preserve">Only after support validates the non-Docker-Desktop Compose provider, NVIDIA CDI path, and CUDA 12.1 package.</w:t>
-            </w:r>
-          </w:p>
-        </w:tc>
-        <w:tc>
-          <w:tcPr>
-            <w:tcW w:w="2600" w:type="dxa"/>
-            <w:vAlign w:val="center"/>
-          </w:tcPr>
-          <w:p>
-            <w:pPr>
-              <w:spacing w:after="45" w:line="260" w:lineRule="auto"/>
-            </w:pPr>
-            <w:r>
-              <w:t>.\setup-towerscout.cmd -Engine podman -Gpu on</w:t>
-            </w:r>
-          </w:p>
-        </w:tc>
-        <w:tc>
-          <w:tcPr>
-            <w:tcW w:w="2260" w:type="dxa"/>
-            <w:vAlign w:val="center"/>
-          </w:tcPr>
-          <w:p>
-            <w:pPr>
-              <w:spacing w:after="45" w:line="260" w:lineRule="auto"/>
-            </w:pPr>
-            <w:r>
-              <w:t>Podman provider, CDI evidence, selected_device=cuda, timing, tile count, detection count, and parity notes.</w:t>
-            </w:r>
-          </w:p>
-        </w:tc>
-      </w:tr>
-    </w:tbl>
-    <w:p>
-      <w:pPr>
-        <w:spacing w:after="120"/>
-      </w:pPr>
-      <w:r>
-        <w:t/>
-      </w:r>
-    </w:p>
-    <w:p>
-      <w:pPr>
-        <w:spacing w:after="120" w:line="300" w:lineRule="auto"/>
-      </w:pPr>
-      <w:r>
-        <w:t xml:space="preserve">Use -Gpu auto only when support is exploring GPU validation with CPU fallback. Use -Gpu on only when support expects CUDA to be available inside the container. The CPU package should reject GPU mode. With -Gpu on, the CUDA package launcher fails closed unless TowerScout reports selected_device=cuda.</w:t>
-      </w:r>
-    </w:p>
-    <w:p>
-      <w:pPr>
-        <w:pStyle w:val="Heading1"/>
-        <w:keepNext/>
-        <w:spacing w:before="260" w:after="120" w:line="300" w:lineRule="auto"/>
-      </w:pPr>
-      <w:r>
-        <w:rPr>
-          <w:b/>
-          <w:color w:val="2E74B5"/>
-          <w:sz w:val="32"/>
-        </w:rPr>
-        <w:t>7. Complete Provider Setup</w:t>
+        <w:t>6. Complete Provider Setup</w:t>
       </w:r>
     </w:p>
     <w:p>
@@ -2074,12 +2218,7 @@
         <w:spacing w:before="260" w:after="120" w:line="300" w:lineRule="auto"/>
       </w:pPr>
       <w:r>
-        <w:rPr>
-          <w:b/>
-          <w:color w:val="2E74B5"/>
-          <w:sz w:val="32"/>
-        </w:rPr>
-        <w:t>8. Run The Required Smoke Test</w:t>
+        <w:t>7. Run The Required Smoke Test</w:t>
       </w:r>
     </w:p>
     <w:p>
@@ -2463,12 +2602,7 @@
         <w:spacing w:before="260" w:after="120" w:line="300" w:lineRule="auto"/>
       </w:pPr>
       <w:r>
-        <w:rPr>
-          <w:b/>
-          <w:color w:val="2E74B5"/>
-          <w:sz w:val="32"/>
-        </w:rPr>
-        <w:t>9. Stop, Restart, Or Check Status</w:t>
+        <w:t>8. Stop, Restart, Or Check Status</w:t>
       </w:r>
     </w:p>
     <w:p>
@@ -2722,12 +2856,7 @@
         <w:spacing w:before="260" w:after="120" w:line="300" w:lineRule="auto"/>
       </w:pPr>
       <w:r>
-        <w:rPr>
-          <w:b/>
-          <w:color w:val="2E74B5"/>
-          <w:sz w:val="32"/>
-        </w:rPr>
-        <w:t>10. What To Send If You Are Blocked</w:t>
+        <w:t>9. What To Send If You Are Blocked</w:t>
       </w:r>
     </w:p>
     <w:tbl>
@@ -3279,15 +3408,227 @@
       <w:pPr>
         <w:pStyle w:val="Heading1"/>
         <w:keepNext/>
-        <w:spacing w:before="260" w:after="120" w:line="300" w:lineRule="auto"/>
-      </w:pPr>
+      </w:pPr>
+      <w:r>
+        <w:t>Appendix A. Optional Support-Assigned Tracks</w:t>
+      </w:r>
+    </w:p>
+    <w:p>
       <w:r>
         <w:rPr>
           <w:b/>
-          <w:color w:val="2E74B5"/>
-          <w:sz w:val="32"/>
         </w:rPr>
-        <w:t>Appendix A. Command Reference</w:t>
+        <w:t xml:space="preserve">Default testers can skip this appendix. </w:t>
+      </w:r>
+      <w:r>
+        <w:t>Use these tracks only when support assigns them. GPU tracks require the CUDA 12.1 Application Package; the CPU package is expected to reject -Gpu on.</w:t>
+      </w:r>
+    </w:p>
+    <w:p>
+      <w:pPr>
+        <w:pStyle w:val="Heading2"/>
+        <w:keepNext/>
+      </w:pPr>
+      <w:r>
+        <w:t>Podman CPU</w:t>
+      </w:r>
+    </w:p>
+    <w:p>
+      <w:pPr>
+        <w:spacing w:after="120"/>
+      </w:pPr>
+      <w:r>
+        <w:rPr>
+          <w:b/>
+        </w:rPr>
+        <w:t xml:space="preserve">When to use it: </w:t>
+      </w:r>
+      <w:r>
+        <w:t>Only if support assigned Podman because Docker Desktop is not the selected local engine. Run the provider helper if setup says no approved Compose provider is available.</w:t>
+      </w:r>
+    </w:p>
+    <w:p>
+      <w:r>
+        <w:rPr>
+          <w:b/>
+        </w:rPr>
+        <w:t>Setup command</w:t>
+      </w:r>
+    </w:p>
+    <w:p>
+      <w:pPr>
+        <w:spacing w:after="80"/>
+        <w:shd w:fill="F1F4F8"/>
+      </w:pPr>
+      <w:r>
+        <w:rPr>
+          <w:rFonts w:ascii="Consolas" w:hAnsi="Consolas"/>
+          <w:sz w:val="20"/>
+        </w:rPr>
+        <w:t>.\setup-towerscout.cmd -Engine podman</w:t>
+      </w:r>
+    </w:p>
+    <w:p>
+      <w:pPr>
+        <w:spacing w:after="120"/>
+      </w:pPr>
+      <w:r>
+        <w:rPr>
+          <w:b/>
+        </w:rPr>
+        <w:t xml:space="preserve">What to record: </w:t>
+      </w:r>
+      <w:r>
+        <w:t>Podman version, machine status, Compose provider, port, readiness state, and smoke result.</w:t>
+      </w:r>
+    </w:p>
+    <w:p>
+      <w:pPr>
+        <w:pStyle w:val="Heading2"/>
+        <w:keepNext/>
+      </w:pPr>
+      <w:r>
+        <w:t>Docker GPU</w:t>
+      </w:r>
+    </w:p>
+    <w:p>
+      <w:pPr>
+        <w:spacing w:after="120"/>
+      </w:pPr>
+      <w:r>
+        <w:rPr>
+          <w:b/>
+        </w:rPr>
+        <w:t xml:space="preserve">When to use it: </w:t>
+      </w:r>
+      <w:r>
+        <w:t>Only on a workstation where support is validating NVIDIA GPU access through Docker and assigned the CUDA 12.1 package.</w:t>
+      </w:r>
+    </w:p>
+    <w:p>
+      <w:r>
+        <w:rPr>
+          <w:b/>
+        </w:rPr>
+        <w:t>Setup command</w:t>
+      </w:r>
+    </w:p>
+    <w:p>
+      <w:pPr>
+        <w:spacing w:after="80"/>
+        <w:shd w:fill="F1F4F8"/>
+      </w:pPr>
+      <w:r>
+        <w:rPr>
+          <w:rFonts w:ascii="Consolas" w:hAnsi="Consolas"/>
+          <w:sz w:val="20"/>
+        </w:rPr>
+        <w:t>.\setup-towerscout.cmd -Engine docker -Gpu auto</w:t>
+      </w:r>
+    </w:p>
+    <w:p>
+      <w:r>
+        <w:t>or</w:t>
+      </w:r>
+    </w:p>
+    <w:p>
+      <w:pPr>
+        <w:spacing w:after="80"/>
+        <w:shd w:fill="F1F4F8"/>
+      </w:pPr>
+      <w:r>
+        <w:rPr>
+          <w:rFonts w:ascii="Consolas" w:hAnsi="Consolas"/>
+          <w:sz w:val="20"/>
+        </w:rPr>
+        <w:t>.\setup-towerscout.cmd -Engine docker -Gpu on</w:t>
+      </w:r>
+    </w:p>
+    <w:p>
+      <w:pPr>
+        <w:spacing w:after="120"/>
+      </w:pPr>
+      <w:r>
+        <w:rPr>
+          <w:b/>
+        </w:rPr>
+        <w:t xml:space="preserve">What to record: </w:t>
+      </w:r>
+      <w:r>
+        <w:t>GPU mode, readiness details, selected_device, timing, tile count, detection count, and parity notes.</w:t>
+      </w:r>
+    </w:p>
+    <w:p>
+      <w:pPr>
+        <w:pStyle w:val="Heading2"/>
+        <w:keepNext/>
+      </w:pPr>
+      <w:r>
+        <w:t>Podman GPU</w:t>
+      </w:r>
+    </w:p>
+    <w:p>
+      <w:pPr>
+        <w:spacing w:after="120"/>
+      </w:pPr>
+      <w:r>
+        <w:rPr>
+          <w:b/>
+        </w:rPr>
+        <w:t xml:space="preserve">When to use it: </w:t>
+      </w:r>
+      <w:r>
+        <w:t>Only after support validates the non-Docker-Desktop Compose provider, NVIDIA CDI path, and CUDA 12.1 package.</w:t>
+      </w:r>
+    </w:p>
+    <w:p>
+      <w:r>
+        <w:rPr>
+          <w:b/>
+        </w:rPr>
+        <w:t>Setup command</w:t>
+      </w:r>
+    </w:p>
+    <w:p>
+      <w:pPr>
+        <w:spacing w:after="80"/>
+        <w:shd w:fill="F1F4F8"/>
+      </w:pPr>
+      <w:r>
+        <w:rPr>
+          <w:rFonts w:ascii="Consolas" w:hAnsi="Consolas"/>
+          <w:sz w:val="20"/>
+        </w:rPr>
+        <w:t>.\setup-towerscout.cmd -Engine podman -Gpu on</w:t>
+      </w:r>
+    </w:p>
+    <w:p>
+      <w:pPr>
+        <w:spacing w:after="120"/>
+      </w:pPr>
+      <w:r>
+        <w:rPr>
+          <w:b/>
+        </w:rPr>
+        <w:t xml:space="preserve">What to record: </w:t>
+      </w:r>
+      <w:r>
+        <w:t>Podman provider, CDI evidence, selected_device=cuda, timing, tile count, detection count, and parity notes.</w:t>
+      </w:r>
+    </w:p>
+    <w:p>
+      <w:r>
+        <w:t>Use -Gpu auto only when support is exploring GPU validation with CPU fallback. Use -Gpu on only when support expects CUDA to be available inside the container. The CPU package should reject GPU mode. With -Gpu on, the CUDA package launcher fails closed unless TowerScout reports selected_device=cuda.</w:t>
+      </w:r>
+    </w:p>
+    <w:p>
+      <w:pPr>
+        <w:pStyle w:val="Heading1"/>
+        <w:keepNext/>
+        <w:spacing w:before="260" w:after="120" w:line="300" w:lineRule="auto"/>
+      </w:pPr>
+      <w:r>
+        <w:t>Appendix B. Command Reference</w:t>
       </w:r>
     </w:p>
     <w:tbl>
@@ -3719,12 +4060,7 @@
         <w:spacing w:before="260" w:after="120" w:line="300" w:lineRule="auto"/>
       </w:pPr>
       <w:r>
-        <w:rPr>
-          <w:b/>
-          <w:color w:val="2E74B5"/>
-          <w:sz w:val="32"/>
-        </w:rPr>
-        <w:t>Appendix B. Source, Licenses, And Notices</w:t>
+        <w:t>Appendix C. Source, Licenses, And Notices</w:t>
       </w:r>
     </w:p>
     <w:p>

</xml_diff>